<commit_message>
Dodaj WP-CLI skriptu za automatizaciju WordPress podešavanja
Pokušano je podizanje pravog lokalnog WordPress-a u sandbox okruženju radi
testiranja i pravih screenshotova, ali mrežna politika blokira Docker Hub i
wordpress.org. Umesto toga dodata je setup-wp-cli.sh koja na pravom hostingu
automatizuje temu, plugin-ove, WooCommerce podešavanja, korisnike, proizvode
i upsell/cross-sell veze; README ažuriran sa tačnim redosledom preostalih
ručnih koraka.
</commit_message>
<xml_diff>
--- a/internet-marketing-projekat/domaci-zadatak-3-wordpress/Domaci_zadatak_3_WordPress_dokumentacija.docx
+++ b/internet-marketing-projekat/domaci-zadatak-3-wordpress/Domaci_zadatak_3_WordPress_dokumentacija.docx
@@ -334,6 +334,63 @@
       </w:r>
       <w:r>
         <w:t xml:space="preserve">.</w:t>
+      </w:r>
+    </w:p>
+    <w:p>
+      <w:pPr>
+        <w:pStyle w:val="BodyText"/>
+      </w:pPr>
+      <w:r>
+        <w:rPr>
+          <w:bCs/>
+          <w:b/>
+        </w:rPr>
+        <w:t xml:space="preserve">Automatizacija:</w:t>
+      </w:r>
+      <w:r>
+        <w:t xml:space="preserve"> </w:t>
+      </w:r>
+      <w:r>
+        <w:t xml:space="preserve">skripta</w:t>
+      </w:r>
+      <w:r>
+        <w:t xml:space="preserve"> </w:t>
+      </w:r>
+      <w:r>
+        <w:rPr>
+          <w:rStyle w:val="VerbatimChar"/>
+        </w:rPr>
+        <w:t xml:space="preserve">setup-wp-cli.sh</w:t>
+      </w:r>
+      <w:r>
+        <w:t xml:space="preserve"> </w:t>
+      </w:r>
+      <w:r>
+        <w:t xml:space="preserve">(u ovom folderu) automatski odrađuje</w:t>
+      </w:r>
+      <w:r>
+        <w:t xml:space="preserve"> </w:t>
+      </w:r>
+      <w:r>
+        <w:t xml:space="preserve">najveći deo ručnih koraka za zahteve 2, 3 (delimično), 5, 6, 7 i 8 (kupon), ukoliko</w:t>
+      </w:r>
+      <w:r>
+        <w:t xml:space="preserve"> </w:t>
+      </w:r>
+      <w:r>
+        <w:t xml:space="preserve">imate WP-CLI pristup hostingu. Videti komentare na vrhu skripte za uputstvo</w:t>
+      </w:r>
+      <w:r>
+        <w:t xml:space="preserve"> </w:t>
+      </w:r>
+      <w:r>
+        <w:t xml:space="preserve">pokretanja. Koraci ispod i dalje važe kao referenca i za ono što skripta ne pokriva</w:t>
+      </w:r>
+      <w:r>
+        <w:t xml:space="preserve"> </w:t>
+      </w:r>
+      <w:r>
+        <w:t xml:space="preserve">(chatbot, slike, screenshotovi, test porudžbine).</w:t>
       </w:r>
     </w:p>
     <w:p>

</xml_diff>

<commit_message>
Uskladi dokumentaciju sa stvarnim brojem SEO primera (2 umesto 3)
</commit_message>
<xml_diff>
--- a/internet-marketing-projekat/domaci-zadatak-3-wordpress/Domaci_zadatak_3_WordPress_dokumentacija.docx
+++ b/internet-marketing-projekat/domaci-zadatak-3-wordpress/Domaci_zadatak_3_WordPress_dokumentacija.docx
@@ -970,13 +970,13 @@
         <w:t xml:space="preserve"> </w:t>
       </w:r>
       <w:r>
-        <w:t xml:space="preserve">Yoast SEO analize za minimum 3</w:t>
-      </w:r>
-      <w:r>
-        <w:t xml:space="preserve"> </w:t>
-      </w:r>
-      <w:r>
-        <w:t xml:space="preserve">stranice/proizvoda (videti</w:t>
+        <w:t xml:space="preserve">Yoast SEO analize za 2</w:t>
+      </w:r>
+      <w:r>
+        <w:t xml:space="preserve"> </w:t>
+      </w:r>
+      <w:r>
+        <w:t xml:space="preserve">proizvoda (videti</w:t>
       </w:r>
       <w:r>
         <w:t xml:space="preserve"> </w:t>

</xml_diff>